<commit_message>
fix: update accessibility statement
</commit_message>
<xml_diff>
--- a/inst/app/www/content/CY/accessibility.docx
+++ b/inst/app/www/content/CY/accessibility.docx
@@ -6,6 +6,40 @@
       <w:pPr>
         <w:pStyle w:val="Heading1"/>
         <w:spacing w:before="240" w:after="0"/>
+        <w:rPr>
+          <w:rStyle w:val="Heading1Char"/>
+          <w:rFonts w:ascii="Calibri" w:hAnsi="Calibri" w:cs="Calibri" w:asciiTheme="minorHAnsi" w:cstheme="minorHAnsi" w:hAnsiTheme="minorHAnsi"/>
+          <w:sz w:val="22"/>
+        </w:rPr>
+      </w:pPr>
+      <w:r>
+        <w:rPr>
+          <w:rStyle w:val="Heading1Char"/>
+          <w:rFonts w:cs="Calibri" w:ascii="Calibri" w:hAnsi="Calibri" w:asciiTheme="minorHAnsi" w:cstheme="minorHAnsi" w:hAnsiTheme="minorHAnsi"/>
+          <w:b/>
+          <w:sz w:val="22"/>
+        </w:rPr>
+        <w:t xml:space="preserve">To go on the footer of the page: </w:t>
+      </w:r>
+      <w:r>
+        <w:rPr>
+          <w:rStyle w:val="Heading1Char"/>
+          <w:rFonts w:ascii="Calibri" w:hAnsi="Calibri" w:asciiTheme="minorHAnsi" w:hAnsiTheme="minorHAnsi"/>
+          <w:sz w:val="22"/>
+        </w:rPr>
+        <w:t xml:space="preserve">Mae'r safle hwn </w:t>
+      </w:r>
+      <w:r>
+        <w:rPr>
+          <w:rFonts w:ascii="Calibri" w:hAnsi="Calibri" w:asciiTheme="minorHAnsi" w:hAnsiTheme="minorHAnsi"/>
+          <w:sz w:val="22"/>
+        </w:rPr>
+        <w:t>yn diwallu gofynion safon WCAG 2.1 AA. I weld ein Datganiad Hygyrchedd, cliciwch YMA.</w:t>
+      </w:r>
+    </w:p>
+    <w:p>
+      <w:pPr>
+        <w:pStyle w:val="Heading1"/>
         <w:rPr>
           <w:rStyle w:val="Heading1Char"/>
           <w:b/>
@@ -622,24 +656,16 @@
         <w:t xml:space="preserve">Canfyddwch sut i gysylltu â </w:t>
       </w:r>
       <w:hyperlink r:id="rId3">
-        <w:commentRangeStart w:id="0"/>
         <w:r>
           <w:rPr>
             <w:rStyle w:val="InternetLink"/>
           </w:rPr>
-          <w:t>ni YMA</w:t>
+          <w:t>platfformdatrysiadau@gig.cymru</w:t>
         </w:r>
       </w:hyperlink>
       <w:r>
         <w:rPr/>
         <w:t>.</w:t>
-      </w:r>
-      <w:commentRangeEnd w:id="0"/>
-      <w:r>
-        <w:commentReference w:id="0"/>
-      </w:r>
-      <w:r>
-        <w:rPr/>
       </w:r>
     </w:p>
     <w:p>
@@ -1121,24 +1147,6 @@
     </w:sectPr>
   </w:body>
 </w:document>
-</file>
-
-<file path=word/comments.xml><?xml version="1.0" encoding="utf-8"?>
-<w:comments xmlns:o="urn:schemas-microsoft-com:office:office" xmlns:r="http://schemas.openxmlformats.org/officeDocument/2006/relationships" xmlns:v="urn:schemas-microsoft-com:vml" xmlns:w="http://schemas.openxmlformats.org/wordprocessingml/2006/main" xmlns:w10="urn:schemas-microsoft-com:office:word" xmlns:wp="http://schemas.openxmlformats.org/drawingml/2006/wordprocessingDrawing" xmlns:wps="http://schemas.microsoft.com/office/word/2010/wordprocessingShape" xmlns:wpg="http://schemas.microsoft.com/office/word/2010/wordprocessingGroup" xmlns:mc="http://schemas.openxmlformats.org/markup-compatibility/2006" xmlns:wp14="http://schemas.microsoft.com/office/word/2010/wordprocessingDrawing" xmlns:w14="http://schemas.microsoft.com/office/word/2010/wordml" mc:Ignorable="w14 wp14">
-  <w:comment w:id="0" w:author="Daniela Stewart (Public Health Wales - No. 2 Capital Quarter)" w:date="2023-03-28T14:24:00Z" w:initials="DS(HW-N2C">
-    <w:p>
-      <w:r>
-        <w:rPr>
-          <w:rFonts w:ascii="Liberation Serif" w:hAnsi="Liberation Serif" w:eastAsia="DejaVu Sans" w:cs="DejaVu Sans"/>
-          <w:sz w:val="24"/>
-          <w:szCs w:val="24"/>
-          <w:lang w:val="en-US" w:eastAsia="en-US" w:bidi="en-US"/>
-        </w:rPr>
-        <w:t>To be changed when domain name is confirmed for launch</w:t>
-      </w:r>
-    </w:p>
-  </w:comment>
-</w:comments>
 </file>
 
 <file path=word/numbering.xml><?xml version="1.0" encoding="utf-8"?>

</xml_diff>

<commit_message>
fix: update contact email address
</commit_message>
<xml_diff>
--- a/inst/app/www/content/CY/accessibility.docx
+++ b/inst/app/www/content/CY/accessibility.docx
@@ -303,7 +303,19 @@
       </w:pPr>
       <w:r>
         <w:rPr/>
-        <w:t>Os oes angen gwybodaeth arnoch ar y wefan hon mewn fformat gwahanol megis PDF hygyrch, print bras, hawdd ei ddarllen, recordiad sain neu braille, anfonwch e-bost at: whocc.ihw@wales.nhs.uk</w:t>
+        <w:t xml:space="preserve">Os oes angen gwybodaeth arnoch ar y wefan hon mewn fformat gwahanol megis PDF hygyrch, print bras, hawdd ei ddarllen, recordiad sain neu braille, anfonwch e-bost at: </w:t>
+      </w:r>
+      <w:hyperlink r:id="rId2">
+        <w:r>
+          <w:rPr>
+            <w:rStyle w:val="InternetLink"/>
+          </w:rPr>
+          <w:t>platfformdatrysiadau@gig.cymru</w:t>
+        </w:r>
+      </w:hyperlink>
+      <w:r>
+        <w:rPr/>
+        <w:t>.</w:t>
       </w:r>
     </w:p>
     <w:p>
@@ -387,8 +399,18 @@
         <w:rPr>
           <w:b/>
         </w:rPr>
-        <w:t>Trwy e-bost: whocc.ihw@wales.nhs.uk</w:t>
-      </w:r>
+        <w:t xml:space="preserve">Trwy e-bost: </w:t>
+      </w:r>
+      <w:hyperlink r:id="rId3">
+        <w:r>
+          <w:rPr>
+            <w:rStyle w:val="InternetLink"/>
+            <w:b w:val="false"/>
+            <w:bCs w:val="false"/>
+          </w:rPr>
+          <w:t>platfformdatrysiadau@gig.cymru</w:t>
+        </w:r>
+      </w:hyperlink>
     </w:p>
     <w:p>
       <w:pPr>
@@ -581,7 +603,7 @@
         <w:rPr/>
         <w:t>Mae'r Comisiwn Cydraddoldeb a Hawliau Dynol (EHRC) yn gyfrifol am orfodi Rheoliadau Hygyrchedd Cyrff y Sector Cyhoeddus (Gwefannau a Chymwysiadau Symudol) (Rhif 2) 2018 (y 'rheoliadau hygyrchedd'). Os nad ydych yn hapus gyda'r ffordd yr ydym yn ymateb i'ch cwyn,</w:t>
       </w:r>
-      <w:hyperlink r:id="rId2">
+      <w:hyperlink r:id="rId4">
         <w:r>
           <w:rPr>
             <w:rStyle w:val="InternetLink"/>
@@ -655,7 +677,7 @@
         <w:rPr/>
         <w:t xml:space="preserve">Canfyddwch sut i gysylltu â </w:t>
       </w:r>
-      <w:hyperlink r:id="rId3">
+      <w:hyperlink r:id="rId5">
         <w:r>
           <w:rPr>
             <w:rStyle w:val="InternetLink"/>
@@ -1815,7 +1837,6 @@
     <w:rPrDefault>
       <w:rPr>
         <w:rFonts w:ascii="Calibri" w:hAnsi="Calibri" w:eastAsia="Calibri" w:cs="" w:asciiTheme="minorHAnsi" w:cstheme="minorBidi" w:eastAsiaTheme="minorHAnsi" w:hAnsiTheme="minorHAnsi"/>
-        <w:sz w:val="22"/>
         <w:szCs w:val="22"/>
         <w:lang w:val="cy-GB" w:eastAsia="en-US" w:bidi="ar-SA"/>
       </w:rPr>
@@ -2205,6 +2226,7 @@
     <w:rsid w:val="005e27c9"/>
     <w:pPr>
       <w:widowControl/>
+      <w:suppressAutoHyphens w:val="true"/>
       <w:bidi w:val="0"/>
       <w:spacing w:lineRule="auto" w:line="259" w:before="0" w:after="160"/>
       <w:jc w:val="left"/>
@@ -2456,6 +2478,14 @@
       <w:rFonts w:ascii="Segoe UI" w:hAnsi="Segoe UI" w:cs="Segoe UI"/>
       <w:sz w:val="18"/>
       <w:szCs w:val="18"/>
+    </w:rPr>
+  </w:style>
+  <w:style w:type="character" w:styleId="VisitedInternetLink">
+    <w:name w:val="FollowedHyperlink"/>
+    <w:rPr>
+      <w:color w:val="800000"/>
+      <w:u w:val="single"/>
+      <w:lang w:val="zxx" w:eastAsia="zxx" w:bidi="zxx"/>
     </w:rPr>
   </w:style>
   <w:style w:type="paragraph" w:styleId="Heading">

</xml_diff>